<commit_message>
one more bittlle in the fittle
</commit_message>
<xml_diff>
--- a/book_of_life_sermons_jennifer_marie_miller.docx
+++ b/book_of_life_sermons_jennifer_marie_miller.docx
@@ -15081,7 +15081,11 @@
       </w:pPr>
       <w:r>
         <w:rPr/>
-        <w:t>XI | Your own, personal Jesus</w:t>
+        <w:t xml:space="preserve">XI | Your own, personal </w:t>
+      </w:r>
+      <w:r>
+        <w:rPr/>
+        <w:t>Messiah</w:t>
       </w:r>
     </w:p>
     <w:p>
@@ -37859,7 +37863,7 @@
       <w:rPr>
         <w:rFonts w:ascii="Liberation Sans" w:hAnsi="Liberation Sans"/>
       </w:rPr>
-      <w:t>1</w:t>
+      <w:t>41</w:t>
     </w:r>
     <w:r>
       <w:rPr>

</xml_diff>